<commit_message>
Aggiunte foto per test con piante malate
</commit_message>
<xml_diff>
--- a/docs/AIA2026_Gruppo08_PP_20260611_1.docx
+++ b/docs/AIA2026_Gruppo08_PP_20260611_1.docx
@@ -6,19 +6,9 @@
       <w:pPr>
         <w:pStyle w:val="Titolo1"/>
       </w:pPr>
-      <w:proofErr w:type="spellStart"/>
       <w:r>
-        <w:t>Proposta</w:t>
+        <w:t>Proposta Progettuale</w:t>
       </w:r>
-      <w:proofErr w:type="spellEnd"/>
-      <w:r>
-        <w:t xml:space="preserve"> </w:t>
-      </w:r>
-      <w:proofErr w:type="spellStart"/>
-      <w:r>
-        <w:t>Progettuale</w:t>
-      </w:r>
-      <w:proofErr w:type="spellEnd"/>
     </w:p>
     <w:p>
       <w:r>
@@ -59,47 +49,13 @@
         <w:t xml:space="preserve">• Computer Vision (VisionService): </w:t>
       </w:r>
       <w:r>
-        <w:t xml:space="preserve">Analisi dell'immagine catturata tramite modelli di apprendimento automatico in </w:t>
+        <w:t>Analisi dell'immagine catturata tramite modelli di apprendimento automatico in grado di identificare la specie vegetale e cont</w:t>
       </w:r>
-      <w:proofErr w:type="spellStart"/>
       <w:r>
-        <w:t>grado</w:t>
+        <w:t>are</w:t>
       </w:r>
-      <w:proofErr w:type="spellEnd"/>
       <w:r>
-        <w:t xml:space="preserve"> di </w:t>
-      </w:r>
-      <w:proofErr w:type="spellStart"/>
-      <w:r>
-        <w:t>identificare</w:t>
-      </w:r>
-      <w:proofErr w:type="spellEnd"/>
-      <w:r>
-        <w:t xml:space="preserve"> la specie </w:t>
-      </w:r>
-      <w:proofErr w:type="spellStart"/>
-      <w:r>
-        <w:t>vegetale</w:t>
-      </w:r>
-      <w:proofErr w:type="spellEnd"/>
-      <w:r>
-        <w:t xml:space="preserve"> e </w:t>
-      </w:r>
-      <w:proofErr w:type="spellStart"/>
-      <w:r>
-        <w:t>conteggiare</w:t>
-      </w:r>
-      <w:proofErr w:type="spellEnd"/>
-      <w:r>
-        <w:t xml:space="preserve"> il </w:t>
-      </w:r>
-      <w:proofErr w:type="spellStart"/>
-      <w:r>
-        <w:t>numero</w:t>
-      </w:r>
-      <w:proofErr w:type="spellEnd"/>
-      <w:r>
-        <w:t xml:space="preserve"> di piantine rilevate.</w:t>
+        <w:t xml:space="preserve"> il numero di piantine rilevate.</w:t>
       </w:r>
       <w:r>
         <w:br/>
@@ -108,103 +64,28 @@
         <w:rPr>
           <w:b/>
         </w:rPr>
-        <w:t xml:space="preserve">• Assistente </w:t>
+        <w:t xml:space="preserve">• Assistente Conversazionale: </w:t>
       </w:r>
-      <w:proofErr w:type="spellStart"/>
       <w:r>
-        <w:rPr>
-          <w:b/>
-        </w:rPr>
-        <w:t>Conversazionale</w:t>
-      </w:r>
-      <w:proofErr w:type="spellEnd"/>
-      <w:r>
-        <w:rPr>
-          <w:b/>
-        </w:rPr>
-        <w:t xml:space="preserve">: </w:t>
-      </w:r>
-      <w:proofErr w:type="spellStart"/>
-      <w:r>
-        <w:t>Configurazione</w:t>
-      </w:r>
-      <w:proofErr w:type="spellEnd"/>
-      <w:r>
-        <w:t xml:space="preserve"> degli </w:t>
-      </w:r>
-      <w:proofErr w:type="spellStart"/>
-      <w:r>
-        <w:t>intenti</w:t>
-      </w:r>
-      <w:proofErr w:type="spellEnd"/>
-      <w:r>
-        <w:t xml:space="preserve"> di </w:t>
-      </w:r>
-      <w:proofErr w:type="spellStart"/>
-      <w:r>
-        <w:t>interazione</w:t>
-      </w:r>
-      <w:proofErr w:type="spellEnd"/>
-      <w:r>
-        <w:t xml:space="preserve"> (es.</w:t>
+        <w:t>Configurazione degli intenti di interazione (es.</w:t>
       </w:r>
       <w:r>
         <w:t xml:space="preserve"> </w:t>
       </w:r>
       <w:r>
-        <w:t>'</w:t>
-      </w:r>
-      <w:proofErr w:type="spellStart"/>
-      <w:r>
-        <w:t>Anali</w:t>
+        <w:t>'Anali</w:t>
       </w:r>
       <w:r>
         <w:t>zza</w:t>
       </w:r>
       <w:r>
-        <w:t>Pianta</w:t>
-      </w:r>
-      <w:proofErr w:type="spellEnd"/>
-      <w:r>
-        <w:t xml:space="preserve">') </w:t>
+        <w:t xml:space="preserve">Pianta') </w:t>
       </w:r>
       <w:r>
-        <w:t xml:space="preserve">e di feedback per </w:t>
-      </w:r>
-      <w:proofErr w:type="spellStart"/>
-      <w:r>
-        <w:t>l’utente</w:t>
-      </w:r>
-      <w:proofErr w:type="spellEnd"/>
-      <w:r>
-        <w:t xml:space="preserve">, </w:t>
+        <w:t xml:space="preserve">e di feedback per l’utente, </w:t>
       </w:r>
       <w:r>
-        <w:t xml:space="preserve">con dispatching </w:t>
-      </w:r>
-      <w:proofErr w:type="spellStart"/>
-      <w:r>
-        <w:t>dinamico</w:t>
-      </w:r>
-      <w:proofErr w:type="spellEnd"/>
-      <w:r>
-        <w:t xml:space="preserve"> </w:t>
-      </w:r>
-      <w:proofErr w:type="spellStart"/>
-      <w:r>
-        <w:t>su</w:t>
-      </w:r>
-      <w:proofErr w:type="spellEnd"/>
-      <w:r>
-        <w:t xml:space="preserve"> </w:t>
-      </w:r>
-      <w:proofErr w:type="spellStart"/>
-      <w:r>
-        <w:t>architettura</w:t>
-      </w:r>
-      <w:proofErr w:type="spellEnd"/>
-      <w:r>
-        <w:t xml:space="preserve"> webhook (app.py).</w:t>
+        <w:t>con dispatching dinamico su architettura webhook (app.py).</w:t>
       </w:r>
       <w:r>
         <w:br/>
@@ -216,125 +97,16 @@
         <w:t xml:space="preserve">• Persistenza dei Dati (DBRepository): </w:t>
       </w:r>
       <w:r>
-        <w:t xml:space="preserve">Salvataggio automatico delle osservazioni </w:t>
-      </w:r>
-      <w:proofErr w:type="spellStart"/>
-      <w:r>
-        <w:t>su</w:t>
-      </w:r>
-      <w:proofErr w:type="spellEnd"/>
-      <w:r>
-        <w:t xml:space="preserve"> un database </w:t>
-      </w:r>
-      <w:proofErr w:type="spellStart"/>
-      <w:r>
-        <w:t>relazionale</w:t>
-      </w:r>
-      <w:proofErr w:type="spellEnd"/>
-      <w:r>
-        <w:t xml:space="preserve"> (MySQL)</w:t>
+        <w:t>Salvataggio automatico delle osservazioni su un database relazionale (MySQL)</w:t>
       </w:r>
       <w:r>
-        <w:t xml:space="preserve"> per un </w:t>
-      </w:r>
-      <w:proofErr w:type="spellStart"/>
-      <w:r>
-        <w:t>periodo</w:t>
-      </w:r>
-      <w:proofErr w:type="spellEnd"/>
-      <w:r>
-        <w:t xml:space="preserve"> di </w:t>
-      </w:r>
-      <w:proofErr w:type="spellStart"/>
-      <w:r>
-        <w:t>osservazione</w:t>
-      </w:r>
-      <w:proofErr w:type="spellEnd"/>
-      <w:r>
-        <w:t xml:space="preserve"> di n </w:t>
-      </w:r>
-      <w:proofErr w:type="spellStart"/>
-      <w:r>
-        <w:t>giorni</w:t>
-      </w:r>
-      <w:proofErr w:type="spellEnd"/>
-      <w:r>
-        <w:t xml:space="preserve">, </w:t>
-      </w:r>
-      <w:proofErr w:type="spellStart"/>
-      <w:r>
-        <w:t>rispettando</w:t>
-      </w:r>
-      <w:proofErr w:type="spellEnd"/>
-      <w:r>
-        <w:t xml:space="preserve"> lo schema logico per le entità plants e observations</w:t>
+        <w:t xml:space="preserve"> per un periodo di osservazione di n giorni</w:t>
       </w:r>
       <w:r>
-        <w:t xml:space="preserve">, per poi in </w:t>
+        <w:t>, rispettando lo schema logico per le entità plants e observations</w:t>
       </w:r>
-      <w:proofErr w:type="spellStart"/>
       <w:r>
-        <w:t>futuro</w:t>
-      </w:r>
-      <w:proofErr w:type="spellEnd"/>
-      <w:r>
-        <w:t xml:space="preserve"> </w:t>
-      </w:r>
-      <w:proofErr w:type="spellStart"/>
-      <w:r>
-        <w:t>usarle</w:t>
-      </w:r>
-      <w:proofErr w:type="spellEnd"/>
-      <w:r>
-        <w:t xml:space="preserve"> per la </w:t>
-      </w:r>
-      <w:proofErr w:type="spellStart"/>
-      <w:r>
-        <w:t>valutazione</w:t>
-      </w:r>
-      <w:proofErr w:type="spellEnd"/>
-      <w:r>
-        <w:t xml:space="preserve"> </w:t>
-      </w:r>
-      <w:proofErr w:type="spellStart"/>
-      <w:r>
-        <w:t>dello</w:t>
-      </w:r>
-      <w:proofErr w:type="spellEnd"/>
-      <w:r>
-        <w:t xml:space="preserve"> </w:t>
-      </w:r>
-      <w:proofErr w:type="spellStart"/>
-      <w:r>
-        <w:t>stato</w:t>
-      </w:r>
-      <w:proofErr w:type="spellEnd"/>
-      <w:r>
-        <w:t xml:space="preserve"> di salute di </w:t>
-      </w:r>
-      <w:proofErr w:type="spellStart"/>
-      <w:r>
-        <w:t>ciascuna</w:t>
-      </w:r>
-      <w:proofErr w:type="spellEnd"/>
-      <w:r>
-        <w:t xml:space="preserve"> </w:t>
-      </w:r>
-      <w:proofErr w:type="spellStart"/>
-      <w:r>
-        <w:t>pianta</w:t>
-      </w:r>
-      <w:proofErr w:type="spellEnd"/>
-      <w:r>
-        <w:t xml:space="preserve"> </w:t>
-      </w:r>
-      <w:proofErr w:type="spellStart"/>
-      <w:r>
-        <w:t>giorno</w:t>
-      </w:r>
-      <w:proofErr w:type="spellEnd"/>
-      <w:r>
-        <w:t xml:space="preserve"> per giorno.</w:t>
+        <w:t>, per poi in futuro usarle per la valutazione dello stato di salute di ciascuna pianta giorno per giorno.</w:t>
       </w:r>
     </w:p>
     <w:p>
@@ -345,144 +117,43 @@
         <w:t>l</w:t>
       </w:r>
       <w:r>
-        <w:t xml:space="preserve"> </w:t>
-      </w:r>
-      <w:proofErr w:type="spellStart"/>
-      <w:r>
-        <w:t>modell</w:t>
+        <w:t xml:space="preserve"> modell</w:t>
       </w:r>
       <w:r>
         <w:t>o</w:t>
       </w:r>
-      <w:proofErr w:type="spellEnd"/>
       <w:r>
-        <w:t xml:space="preserve"> di classificazione, l'aggiunta di </w:t>
-      </w:r>
-      <w:proofErr w:type="spellStart"/>
-      <w:r>
-        <w:t>intenti</w:t>
-      </w:r>
-      <w:proofErr w:type="spellEnd"/>
-      <w:r>
-        <w:t xml:space="preserve"> per </w:t>
-      </w:r>
-      <w:proofErr w:type="spellStart"/>
-      <w:r>
-        <w:t>consultare</w:t>
-      </w:r>
-      <w:proofErr w:type="spellEnd"/>
-      <w:r>
-        <w:t xml:space="preserve"> </w:t>
-      </w:r>
-      <w:proofErr w:type="spellStart"/>
-      <w:r>
-        <w:t>una</w:t>
-      </w:r>
-      <w:proofErr w:type="spellEnd"/>
-      <w:r>
-        <w:t xml:space="preserve"> wiki </w:t>
-      </w:r>
-      <w:proofErr w:type="spellStart"/>
-      <w:r>
-        <w:t>riguardante</w:t>
-      </w:r>
-      <w:proofErr w:type="spellEnd"/>
-      <w:r>
-        <w:t xml:space="preserve"> la </w:t>
-      </w:r>
-      <w:proofErr w:type="spellStart"/>
-      <w:r>
-        <w:t>singola</w:t>
-      </w:r>
-      <w:proofErr w:type="spellEnd"/>
-      <w:r>
-        <w:t xml:space="preserve"> specie e, </w:t>
-      </w:r>
-      <w:proofErr w:type="spellStart"/>
-      <w:r>
-        <w:t>valutare</w:t>
-      </w:r>
-      <w:proofErr w:type="spellEnd"/>
-      <w:r>
-        <w:t xml:space="preserve"> lo </w:t>
-      </w:r>
-      <w:proofErr w:type="spellStart"/>
-      <w:r>
-        <w:t>stato</w:t>
-      </w:r>
-      <w:proofErr w:type="spellEnd"/>
-      <w:r>
-        <w:t xml:space="preserve"> </w:t>
-      </w:r>
-      <w:proofErr w:type="spellStart"/>
-      <w:r>
-        <w:t>sanitario</w:t>
-      </w:r>
-      <w:proofErr w:type="spellEnd"/>
-      <w:r>
-        <w:t xml:space="preserve"> della </w:t>
-      </w:r>
-      <w:proofErr w:type="spellStart"/>
-      <w:r>
-        <w:t>singola</w:t>
-      </w:r>
-      <w:proofErr w:type="spellEnd"/>
-      <w:r>
-        <w:t xml:space="preserve"> </w:t>
-      </w:r>
-      <w:proofErr w:type="spellStart"/>
-      <w:r>
-        <w:t>pianta</w:t>
-      </w:r>
-      <w:proofErr w:type="spellEnd"/>
-      <w:r>
-        <w:t xml:space="preserve">, </w:t>
-      </w:r>
-      <w:proofErr w:type="spellStart"/>
-      <w:r>
-        <w:t>stima</w:t>
+        <w:t xml:space="preserve"> di classificazione, l'aggiunta di intenti per consultare </w:t>
       </w:r>
       <w:r>
-        <w:t>ndo</w:t>
-      </w:r>
-      <w:proofErr w:type="spellEnd"/>
-      <w:r>
-        <w:t xml:space="preserve"> </w:t>
+        <w:t xml:space="preserve">una wiki riguardante la singola specie, </w:t>
       </w:r>
       <w:r>
-        <w:t xml:space="preserve">la </w:t>
+        <w:t>valutare lo stato sanitario</w:t>
       </w:r>
-      <w:proofErr w:type="spellStart"/>
       <w:r>
-        <w:t>percentuale</w:t>
+        <w:t xml:space="preserve"> della singola pianta</w:t>
       </w:r>
-      <w:proofErr w:type="spellEnd"/>
       <w:r>
-        <w:t xml:space="preserve"> di area </w:t>
+        <w:t>, stima</w:t>
       </w:r>
-      <w:proofErr w:type="spellStart"/>
       <w:r>
-        <w:t>fogliare</w:t>
+        <w:t xml:space="preserve">ndo </w:t>
       </w:r>
-      <w:proofErr w:type="spellEnd"/>
       <w:r>
-        <w:t xml:space="preserve"> con </w:t>
+        <w:t>la percentuale di area fogliare con anomalie</w:t>
       </w:r>
-      <w:proofErr w:type="spellStart"/>
       <w:r>
-        <w:t>anomalie</w:t>
+        <w:t xml:space="preserve"> cromatiche</w:t>
       </w:r>
-      <w:proofErr w:type="spellEnd"/>
       <w:r>
-        <w:t xml:space="preserve"> </w:t>
+        <w:t xml:space="preserve"> e implementazione di chat vocale </w:t>
       </w:r>
-      <w:proofErr w:type="spellStart"/>
       <w:r>
-        <w:t>cromatiche</w:t>
+        <w:t>per l’utilizzo del</w:t>
       </w:r>
-      <w:proofErr w:type="spellEnd"/>
       <w:r>
-        <w:t>.</w:t>
+        <w:t>l’applicativo.</w:t>
       </w:r>
     </w:p>
     <w:p/>
@@ -519,15 +190,7 @@
         <w:pStyle w:val="Titolo2"/>
       </w:pPr>
       <w:r>
-        <w:t xml:space="preserve">Scenario </w:t>
-      </w:r>
-      <w:proofErr w:type="spellStart"/>
-      <w:r>
-        <w:t>d'uso</w:t>
-      </w:r>
-      <w:proofErr w:type="spellEnd"/>
-      <w:r>
-        <w:t xml:space="preserve"> per la demo dell'ultimo incontro</w:t>
+        <w:t>Scenario d'uso per la demo dell'ultimo incontro</w:t>
       </w:r>
     </w:p>
     <w:p>
@@ -537,144 +200,49 @@
     </w:p>
     <w:p>
       <w:r>
-        <w:t xml:space="preserve">Durante la dimostrazione, un utente (simulante un operatore agricolo) avvierà una conversazione con l'agente virtuale Smart-Agri. Dopo il saluto iniziale, l'utente chiederà al </w:t>
+        <w:t>Durante la dimostrazione, un utente (simulante un operatore agricolo) avvierà una conversazione con l'agente virtuale Smart-Agri</w:t>
       </w:r>
-      <w:proofErr w:type="spellStart"/>
       <w:r>
-        <w:t>sistema</w:t>
+        <w:t xml:space="preserve"> tramite una pagina web dedicata</w:t>
       </w:r>
-      <w:proofErr w:type="spellEnd"/>
       <w:r>
-        <w:t xml:space="preserve"> di </w:t>
+        <w:t xml:space="preserve">. Dopo il saluto iniziale, l'utente chiederà al sistema di analizzare </w:t>
       </w:r>
-      <w:proofErr w:type="spellStart"/>
       <w:r>
-        <w:t>analizzare</w:t>
+        <w:t>l’ambiente</w:t>
       </w:r>
-      <w:proofErr w:type="spellEnd"/>
       <w:r>
         <w:t xml:space="preserve"> </w:t>
       </w:r>
       <w:r>
-        <w:t xml:space="preserve">diverse </w:t>
-      </w:r>
-      <w:proofErr w:type="spellStart"/>
-      <w:r>
-        <w:t>piante</w:t>
-      </w:r>
-      <w:proofErr w:type="spellEnd"/>
-      <w:r>
-        <w:t xml:space="preserve"> (</w:t>
-      </w:r>
-      <w:proofErr w:type="spellStart"/>
-      <w:r>
-        <w:t>almeno</w:t>
-      </w:r>
-      <w:proofErr w:type="spellEnd"/>
-      <w:r>
-        <w:t xml:space="preserve"> due) </w:t>
-      </w:r>
-      <w:proofErr w:type="spellStart"/>
-      <w:r>
-        <w:t>posizionat</w:t>
+        <w:t>(es. formulando l'intento: "Analizza questa pianta")</w:t>
       </w:r>
       <w:r>
-        <w:t>e</w:t>
-      </w:r>
-      <w:proofErr w:type="spellEnd"/>
-      <w:r>
-        <w:t xml:space="preserve"> di </w:t>
-      </w:r>
-      <w:proofErr w:type="spellStart"/>
-      <w:r>
-        <w:t>fronte</w:t>
-      </w:r>
-      <w:proofErr w:type="spellEnd"/>
-      <w:r>
-        <w:t xml:space="preserve"> alla webcam (es. </w:t>
-      </w:r>
-      <w:proofErr w:type="spellStart"/>
-      <w:r>
-        <w:t>formulando</w:t>
-      </w:r>
-      <w:proofErr w:type="spellEnd"/>
-      <w:r>
-        <w:t xml:space="preserve"> </w:t>
-      </w:r>
-      <w:proofErr w:type="spellStart"/>
-      <w:r>
-        <w:t>l'intento</w:t>
-      </w:r>
-      <w:proofErr w:type="spellEnd"/>
-      <w:r>
-        <w:t>: "</w:t>
-      </w:r>
-      <w:proofErr w:type="spellStart"/>
-      <w:r>
-        <w:t>Analizza</w:t>
-      </w:r>
-      <w:proofErr w:type="spellEnd"/>
-      <w:r>
-        <w:t xml:space="preserve"> </w:t>
-      </w:r>
-      <w:proofErr w:type="spellStart"/>
-      <w:r>
-        <w:t>questa</w:t>
-      </w:r>
-      <w:proofErr w:type="spellEnd"/>
-      <w:r>
-        <w:t xml:space="preserve"> </w:t>
-      </w:r>
-      <w:proofErr w:type="spellStart"/>
-      <w:r>
-        <w:t>piant</w:t>
+        <w:t xml:space="preserve"> simulato</w:t>
       </w:r>
       <w:r>
-        <w:t>a</w:t>
+        <w:t xml:space="preserve"> tramite </w:t>
       </w:r>
-      <w:proofErr w:type="spellEnd"/>
       <w:r>
-        <w:t xml:space="preserve">"). In tempo reale, il backend riceverà la richiesta via webhook da Dialogflow, attiverà il modulo CameraService per estrarre il frame video e lo passerà al VisionService. Il modello di Computer Vision </w:t>
+        <w:t>un frame</w:t>
       </w:r>
-      <w:proofErr w:type="spellStart"/>
       <w:r>
-        <w:t>processerà</w:t>
+        <w:t xml:space="preserve"> statico di test che </w:t>
       </w:r>
-      <w:proofErr w:type="spellEnd"/>
       <w:r>
-        <w:t xml:space="preserve"> </w:t>
+        <w:t>emula</w:t>
       </w:r>
-      <w:proofErr w:type="spellStart"/>
       <w:r>
-        <w:t>l'immagine</w:t>
+        <w:t xml:space="preserve"> il comportamento dell’applicativo finale</w:t>
       </w:r>
-      <w:proofErr w:type="spellEnd"/>
       <w:r>
-        <w:t xml:space="preserve">, </w:t>
+        <w:t>. In tempo reale, il backend riceverà la richiesta via webhook da Dialogflow, attiverà il modulo CameraService per estrarre il frame e lo passerà al VisionService. Il modello di Computer Vision processerà l'immagine</w:t>
       </w:r>
-      <w:proofErr w:type="spellStart"/>
       <w:r>
-        <w:t>contando</w:t>
+        <w:t xml:space="preserve">, contando le piantine, </w:t>
       </w:r>
-      <w:proofErr w:type="spellEnd"/>
       <w:r>
-        <w:t xml:space="preserve"> le </w:t>
-      </w:r>
-      <w:proofErr w:type="spellStart"/>
-      <w:r>
-        <w:t>piantine</w:t>
-      </w:r>
-      <w:proofErr w:type="spellEnd"/>
-      <w:r>
-        <w:t xml:space="preserve">, </w:t>
-      </w:r>
-      <w:proofErr w:type="spellStart"/>
-      <w:r>
-        <w:t>identificando</w:t>
-      </w:r>
-      <w:proofErr w:type="spellEnd"/>
-      <w:r>
-        <w:t xml:space="preserve"> la specie (es. Pomodoro)</w:t>
+        <w:t>identificando la specie (es. Pomodoro)</w:t>
       </w:r>
       <w:r>
         <w:t xml:space="preserve"> e</w:t>
@@ -682,187 +250,39 @@
       <w:r>
         <w:t xml:space="preserve"> </w:t>
       </w:r>
-      <w:proofErr w:type="spellStart"/>
       <w:r>
-        <w:t>diagnosticando</w:t>
+        <w:t>riportando lo stato dell’ambiente analizzato</w:t>
       </w:r>
-      <w:proofErr w:type="spellEnd"/>
-      <w:r>
-        <w:t xml:space="preserve"> </w:t>
-      </w:r>
-      <w:proofErr w:type="spellStart"/>
-      <w:r>
-        <w:t>eventuali</w:t>
-      </w:r>
-      <w:proofErr w:type="spellEnd"/>
-      <w:r>
-        <w:t xml:space="preserve"> </w:t>
-      </w:r>
-      <w:proofErr w:type="spellStart"/>
-      <w:r>
-        <w:t>patologie</w:t>
-      </w:r>
-      <w:proofErr w:type="spellEnd"/>
       <w:r>
         <w:t>.</w:t>
       </w:r>
     </w:p>
     <w:p>
+      <w:pPr>
+        <w:rPr>
+          <w:u w:val="single"/>
+        </w:rPr>
+      </w:pPr>
       <w:r>
-        <w:t xml:space="preserve"> </w:t>
+        <w:t xml:space="preserve"> Terminato il calcolo (con un vincolo di tempo massimo per evitare timeout), il sistema salverà in modo persistente questi dati all'interno del database MySQL (smart_agri), legandoli allo storico delle osservazioni. L'assistente virtuale risponderà quindi </w:t>
       </w:r>
-      <w:proofErr w:type="spellStart"/>
       <w:r>
-        <w:t>Terminato</w:t>
+        <w:t>t</w:t>
       </w:r>
-      <w:proofErr w:type="spellEnd"/>
       <w:r>
-        <w:t xml:space="preserve"> il </w:t>
+        <w:t xml:space="preserve">estualmente all'utente, fornendo </w:t>
       </w:r>
-      <w:proofErr w:type="spellStart"/>
       <w:r>
-        <w:t>calcolo</w:t>
+        <w:t>le risposte alle domande effetuate</w:t>
       </w:r>
-      <w:proofErr w:type="spellEnd"/>
-      <w:r>
-        <w:t xml:space="preserve"> (con un vincolo di tempo massimo per evitare timeout), il sistema salverà in modo persistente questi dati all'interno del database MySQL (smart_agri), legandoli allo storico delle osservazioni. </w:t>
-      </w:r>
-      <w:proofErr w:type="spellStart"/>
-      <w:r>
-        <w:t>L'assistente</w:t>
-      </w:r>
-      <w:proofErr w:type="spellEnd"/>
-      <w:r>
-        <w:t xml:space="preserve"> </w:t>
-      </w:r>
-      <w:proofErr w:type="spellStart"/>
-      <w:r>
-        <w:t>virtuale</w:t>
-      </w:r>
-      <w:proofErr w:type="spellEnd"/>
-      <w:r>
-        <w:t xml:space="preserve"> </w:t>
-      </w:r>
-      <w:proofErr w:type="spellStart"/>
-      <w:r>
-        <w:t>risponderà</w:t>
-      </w:r>
-      <w:proofErr w:type="spellEnd"/>
-      <w:r>
-        <w:t xml:space="preserve"> </w:t>
-      </w:r>
-      <w:proofErr w:type="spellStart"/>
-      <w:r>
-        <w:t>quindi</w:t>
-      </w:r>
-      <w:proofErr w:type="spellEnd"/>
-      <w:r>
-        <w:t xml:space="preserve"> </w:t>
-      </w:r>
-      <w:proofErr w:type="spellStart"/>
-      <w:r>
-        <w:t>vocalmente</w:t>
-      </w:r>
-      <w:proofErr w:type="spellEnd"/>
-      <w:r>
-        <w:t xml:space="preserve"> o </w:t>
-      </w:r>
-      <w:proofErr w:type="spellStart"/>
-      <w:r>
-        <w:t>testualmente</w:t>
-      </w:r>
-      <w:proofErr w:type="spellEnd"/>
-      <w:r>
-        <w:t xml:space="preserve"> </w:t>
-      </w:r>
-      <w:proofErr w:type="spellStart"/>
-      <w:r>
-        <w:t>all'utente</w:t>
-      </w:r>
-      <w:proofErr w:type="spellEnd"/>
-      <w:r>
-        <w:t xml:space="preserve">, </w:t>
-      </w:r>
-      <w:proofErr w:type="spellStart"/>
-      <w:r>
-        <w:t>fornendo</w:t>
-      </w:r>
-      <w:proofErr w:type="spellEnd"/>
       <w:r>
         <w:t xml:space="preserve"> </w:t>
       </w:r>
       <w:r>
-        <w:t xml:space="preserve">le </w:t>
-      </w:r>
-      <w:proofErr w:type="spellStart"/>
-      <w:r>
-        <w:t>risposte</w:t>
-      </w:r>
-      <w:proofErr w:type="spellEnd"/>
-      <w:r>
-        <w:t xml:space="preserve"> alle </w:t>
-      </w:r>
-      <w:proofErr w:type="spellStart"/>
-      <w:r>
-        <w:t>domande</w:t>
-      </w:r>
-      <w:proofErr w:type="spellEnd"/>
-      <w:r>
-        <w:t xml:space="preserve"> </w:t>
-      </w:r>
-      <w:proofErr w:type="spellStart"/>
-      <w:r>
-        <w:t>effetuate</w:t>
-      </w:r>
-      <w:proofErr w:type="spellEnd"/>
-      <w:r>
-        <w:t xml:space="preserve"> e, </w:t>
-      </w:r>
-      <w:proofErr w:type="spellStart"/>
-      <w:r>
-        <w:t>qualora</w:t>
-      </w:r>
-      <w:proofErr w:type="spellEnd"/>
-      <w:r>
-        <w:t xml:space="preserve"> la </w:t>
+        <w:t>riguardanti sia l’ambiente nel complesso che le piante nello specifico</w:t>
       </w:r>
       <w:r>
-        <w:t>camera</w:t>
-      </w:r>
-      <w:r>
-        <w:t xml:space="preserve"> non fosse </w:t>
-      </w:r>
-      <w:proofErr w:type="spellStart"/>
-      <w:r>
-        <w:t>stata</w:t>
-      </w:r>
-      <w:proofErr w:type="spellEnd"/>
-      <w:r>
-        <w:t xml:space="preserve"> </w:t>
-      </w:r>
-      <w:proofErr w:type="spellStart"/>
-      <w:r>
-        <w:t>inquadrata</w:t>
-      </w:r>
-      <w:proofErr w:type="spellEnd"/>
-      <w:r>
-        <w:t xml:space="preserve"> </w:t>
-      </w:r>
-      <w:proofErr w:type="spellStart"/>
-      <w:r>
-        <w:t>correttamente</w:t>
-      </w:r>
-      <w:proofErr w:type="spellEnd"/>
-      <w:r>
-        <w:t xml:space="preserve">, </w:t>
-      </w:r>
-      <w:proofErr w:type="spellStart"/>
-      <w:r>
-        <w:t>suggerendo</w:t>
-      </w:r>
-      <w:proofErr w:type="spellEnd"/>
-      <w:r>
-        <w:t xml:space="preserve"> di riposizionare l'obiettivo. Questo flusso end-to-end dimostra la solidità dell'infrastruttura di analisi e acquisizione dati, confermando la predisposizione del sistema all'integrazione del restante 30% delle funzionalità relative all'interrogazione dello storico.</w:t>
+        <w:t>. Questo flusso end-to-end dimostra la solidità dell'infrastruttura di analisi e acquisizione dati, confermando la predisposizione del sistema all'integrazione del restante 30% delle funzionalità relative all'interrogazione dello storico.</w:t>
       </w:r>
     </w:p>
     <w:sectPr>
@@ -984,7 +404,14 @@
         <w:rFonts w:asciiTheme="majorHAnsi" w:hAnsiTheme="majorHAnsi" w:cstheme="majorHAnsi"/>
         <w:color w:val="1F497D" w:themeColor="text2"/>
       </w:rPr>
-      <w:t>0611</w:t>
+      <w:t>061</w:t>
+    </w:r>
+    <w:r>
+      <w:rPr>
+        <w:rFonts w:asciiTheme="majorHAnsi" w:hAnsiTheme="majorHAnsi" w:cstheme="majorHAnsi"/>
+        <w:color w:val="1F497D" w:themeColor="text2"/>
+      </w:rPr>
+      <w:t>8</w:t>
     </w:r>
     <w:r>
       <w:rPr>
@@ -1016,39 +443,7 @@
         <w:rFonts w:asciiTheme="majorHAnsi" w:hAnsiTheme="majorHAnsi" w:cstheme="majorHAnsi"/>
         <w:color w:val="1F497D" w:themeColor="text2"/>
       </w:rPr>
-      <w:t xml:space="preserve">Titolo </w:t>
-    </w:r>
-    <w:proofErr w:type="spellStart"/>
-    <w:r>
-      <w:rPr>
-        <w:rFonts w:asciiTheme="majorHAnsi" w:hAnsiTheme="majorHAnsi" w:cstheme="majorHAnsi"/>
-        <w:color w:val="1F497D" w:themeColor="text2"/>
-      </w:rPr>
-      <w:t>Proposta</w:t>
-    </w:r>
-    <w:proofErr w:type="spellEnd"/>
-    <w:r>
-      <w:rPr>
-        <w:rFonts w:asciiTheme="majorHAnsi" w:hAnsiTheme="majorHAnsi" w:cstheme="majorHAnsi"/>
-        <w:color w:val="1F497D" w:themeColor="text2"/>
-      </w:rPr>
-      <w:t xml:space="preserve"> </w:t>
-    </w:r>
-    <w:proofErr w:type="spellStart"/>
-    <w:r>
-      <w:rPr>
-        <w:rFonts w:asciiTheme="majorHAnsi" w:hAnsiTheme="majorHAnsi" w:cstheme="majorHAnsi"/>
-        <w:color w:val="1F497D" w:themeColor="text2"/>
-      </w:rPr>
-      <w:t>Progettuale</w:t>
-    </w:r>
-    <w:proofErr w:type="spellEnd"/>
-    <w:r>
-      <w:rPr>
-        <w:rFonts w:asciiTheme="majorHAnsi" w:hAnsiTheme="majorHAnsi" w:cstheme="majorHAnsi"/>
-        <w:color w:val="1F497D" w:themeColor="text2"/>
-      </w:rPr>
-      <w:t xml:space="preserve">: </w:t>
+      <w:t xml:space="preserve">Titolo Proposta Progettuale: </w:t>
     </w:r>
     <w:r>
       <w:rPr>

</xml_diff>